<commit_message>
fix: payloads dos alertas sem {{plot()}} nem {{strategy.order.action}} (corrige erro JSON Expected })
</commit_message>
<xml_diff>
--- a/ALERTAS_TRADINGVIEW_SNIPER.docx
+++ b/ALERTAS_TRADINGVIEW_SNIPER.docx
@@ -382,6 +382,637 @@
     </w:p>
     <w:p>
       <w:pPr>
+        <w:pStyle w:val="BlockText"/>
+      </w:pPr>
+      <w:r>
+        <w:t xml:space="preserve">⚠️</w:t>
+      </w:r>
+      <w:r>
+        <w:t xml:space="preserve"> </w:t>
+      </w:r>
+      <w:r>
+        <w:rPr>
+          <w:bCs/>
+          <w:b/>
+        </w:rPr>
+        <w:t xml:space="preserve">IMPORTANTE — não use</w:t>
+      </w:r>
+      <w:r>
+        <w:rPr>
+          <w:bCs/>
+          <w:b/>
+        </w:rPr>
+        <w:t xml:space="preserve"> </w:t>
+      </w:r>
+      <w:r>
+        <w:rPr>
+          <w:rStyle w:val="VerbatimChar"/>
+          <w:bCs/>
+          <w:b/>
+        </w:rPr>
+        <w:t xml:space="preserve">{{plot("RSI")}}</w:t>
+      </w:r>
+      <w:r>
+        <w:rPr>
+          <w:bCs/>
+          <w:b/>
+        </w:rPr>
+        <w:t xml:space="preserve"> </w:t>
+      </w:r>
+      <w:r>
+        <w:rPr>
+          <w:bCs/>
+          <w:b/>
+        </w:rPr>
+        <w:t xml:space="preserve">nem</w:t>
+      </w:r>
+      <w:r>
+        <w:rPr>
+          <w:bCs/>
+          <w:b/>
+        </w:rPr>
+        <w:t xml:space="preserve"> </w:t>
+      </w:r>
+      <w:r>
+        <w:rPr>
+          <w:rStyle w:val="VerbatimChar"/>
+          <w:bCs/>
+          <w:b/>
+        </w:rPr>
+        <w:t xml:space="preserve">{{strategy.order.action}}</w:t>
+      </w:r>
+      <w:r>
+        <w:rPr>
+          <w:bCs/>
+          <w:b/>
+        </w:rPr>
+        <w:t xml:space="preserve">.</w:t>
+      </w:r>
+      <w:r>
+        <w:t xml:space="preserve"> </w:t>
+      </w:r>
+      <w:r>
+        <w:t xml:space="preserve">Esses placeholders</w:t>
+      </w:r>
+      <w:r>
+        <w:t xml:space="preserve"> </w:t>
+      </w:r>
+      <w:r>
+        <w:rPr>
+          <w:bCs/>
+          <w:b/>
+        </w:rPr>
+        <w:t xml:space="preserve">não existem</w:t>
+      </w:r>
+      <w:r>
+        <w:t xml:space="preserve"> </w:t>
+      </w:r>
+      <w:r>
+        <w:t xml:space="preserve">no indicador TSTS Sniper. Quando o TradingView não os encontra, deixa o campo vazio e o JSON quebra (erro</w:t>
+      </w:r>
+      <w:r>
+        <w:t xml:space="preserve"> </w:t>
+      </w:r>
+      <w:r>
+        <w:rPr>
+          <w:bCs/>
+          <w:b/>
+        </w:rPr>
+        <w:t xml:space="preserve">“</w:t>
+      </w:r>
+      <w:r>
+        <w:rPr>
+          <w:bCs/>
+          <w:b/>
+        </w:rPr>
+        <w:t xml:space="preserve">Expected</w:t>
+      </w:r>
+      <w:r>
+        <w:rPr>
+          <w:bCs/>
+          <w:b/>
+        </w:rPr>
+        <w:t xml:space="preserve"> </w:t>
+      </w:r>
+      <w:r>
+        <w:rPr>
+          <w:bCs/>
+          <w:b/>
+        </w:rPr>
+        <w:t xml:space="preserve">‘</w:t>
+      </w:r>
+      <w:r>
+        <w:rPr>
+          <w:bCs/>
+          <w:b/>
+        </w:rPr>
+        <w:t xml:space="preserve">}</w:t>
+      </w:r>
+      <w:r>
+        <w:rPr>
+          <w:bCs/>
+          <w:b/>
+        </w:rPr>
+        <w:t xml:space="preserve">’</w:t>
+      </w:r>
+      <w:r>
+        <w:rPr>
+          <w:bCs/>
+          <w:b/>
+        </w:rPr>
+        <w:t xml:space="preserve">”</w:t>
+      </w:r>
+      <w:r>
+        <w:t xml:space="preserve">). Como o TSTS Sniper é um</w:t>
+      </w:r>
+      <w:r>
+        <w:t xml:space="preserve"> </w:t>
+      </w:r>
+      <w:r>
+        <w:rPr>
+          <w:iCs/>
+          <w:i/>
+        </w:rPr>
+        <w:t xml:space="preserve">indicador</w:t>
+      </w:r>
+      <w:r>
+        <w:t xml:space="preserve"> </w:t>
+      </w:r>
+      <w:r>
+        <w:t xml:space="preserve">(study) e não uma</w:t>
+      </w:r>
+      <w:r>
+        <w:t xml:space="preserve"> </w:t>
+      </w:r>
+      <w:r>
+        <w:rPr>
+          <w:iCs/>
+          <w:i/>
+        </w:rPr>
+        <w:t xml:space="preserve">strategy</w:t>
+      </w:r>
+      <w:r>
+        <w:t xml:space="preserve">,</w:t>
+      </w:r>
+      <w:r>
+        <w:t xml:space="preserve"> </w:t>
+      </w:r>
+      <w:r>
+        <w:rPr>
+          <w:rStyle w:val="VerbatimChar"/>
+        </w:rPr>
+        <w:t xml:space="preserve">{{strategy.order.action}}</w:t>
+      </w:r>
+      <w:r>
+        <w:t xml:space="preserve"> </w:t>
+      </w:r>
+      <w:r>
+        <w:t xml:space="preserve">também fica vazio.</w:t>
+      </w:r>
+    </w:p>
+    <w:p>
+      <w:pPr>
+        <w:pStyle w:val="BlockText"/>
+      </w:pPr>
+      <w:r>
+        <w:rPr>
+          <w:bCs/>
+          <w:b/>
+        </w:rPr>
+        <w:t xml:space="preserve">Solução:</w:t>
+      </w:r>
+      <w:r>
+        <w:t xml:space="preserve"> </w:t>
+      </w:r>
+      <w:r>
+        <w:rPr>
+          <w:rStyle w:val="VerbatimChar"/>
+        </w:rPr>
+        <w:t xml:space="preserve">action</w:t>
+      </w:r>
+      <w:r>
+        <w:t xml:space="preserve"> </w:t>
+      </w:r>
+      <w:r>
+        <w:t xml:space="preserve">é</w:t>
+      </w:r>
+      <w:r>
+        <w:t xml:space="preserve"> </w:t>
+      </w:r>
+      <w:r>
+        <w:rPr>
+          <w:bCs/>
+          <w:b/>
+        </w:rPr>
+        <w:t xml:space="preserve">fixo</w:t>
+      </w:r>
+      <w:r>
+        <w:t xml:space="preserve"> </w:t>
+      </w:r>
+      <w:r>
+        <w:t xml:space="preserve">— você já sabe a direção pelo nome do alerta (UP = buy, DOWN = sell). Crie</w:t>
+      </w:r>
+      <w:r>
+        <w:t xml:space="preserve"> </w:t>
+      </w:r>
+      <w:r>
+        <w:rPr>
+          <w:bCs/>
+          <w:b/>
+        </w:rPr>
+        <w:t xml:space="preserve">dois alertas separados</w:t>
+      </w:r>
+      <w:r>
+        <w:t xml:space="preserve"> </w:t>
+      </w:r>
+      <w:r>
+        <w:t xml:space="preserve">por moeda+TF: um para o cruzamento Pink×Blue</w:t>
+      </w:r>
+      <w:r>
+        <w:t xml:space="preserve"> </w:t>
+      </w:r>
+      <w:r>
+        <w:rPr>
+          <w:bCs/>
+          <w:b/>
+        </w:rPr>
+        <w:t xml:space="preserve">pra cima</w:t>
+      </w:r>
+      <w:r>
+        <w:t xml:space="preserve"> </w:t>
+      </w:r>
+      <w:r>
+        <w:t xml:space="preserve">e outro</w:t>
+      </w:r>
+      <w:r>
+        <w:t xml:space="preserve"> </w:t>
+      </w:r>
+      <w:r>
+        <w:rPr>
+          <w:bCs/>
+          <w:b/>
+        </w:rPr>
+        <w:t xml:space="preserve">pra baixo</w:t>
+      </w:r>
+      <w:r>
+        <w:t xml:space="preserve">.</w:t>
+      </w:r>
+    </w:p>
+    <w:p>
+      <w:pPr>
+        <w:pStyle w:val="FirstParagraph"/>
+      </w:pPr>
+      <w:r>
+        <w:rPr>
+          <w:bCs/>
+          <w:b/>
+        </w:rPr>
+        <w:t xml:space="preserve">Payload JSON — Pink × Blue UP (compra):</w:t>
+      </w:r>
+    </w:p>
+    <w:p>
+      <w:pPr>
+        <w:pStyle w:val="SourceCode"/>
+      </w:pPr>
+      <w:r>
+        <w:rPr>
+          <w:rStyle w:val="FunctionTok"/>
+        </w:rPr>
+        <w:t xml:space="preserve">{</w:t>
+      </w:r>
+      <w:r>
+        <w:rPr>
+          <w:rStyle w:val="DataTypeTok"/>
+        </w:rPr>
+        <w:t xml:space="preserve">"action"</w:t>
+      </w:r>
+      <w:r>
+        <w:rPr>
+          <w:rStyle w:val="FunctionTok"/>
+        </w:rPr>
+        <w:t xml:space="preserve">:</w:t>
+      </w:r>
+      <w:r>
+        <w:rPr>
+          <w:rStyle w:val="StringTok"/>
+        </w:rPr>
+        <w:t xml:space="preserve">"buy"</w:t>
+      </w:r>
+      <w:r>
+        <w:rPr>
+          <w:rStyle w:val="FunctionTok"/>
+        </w:rPr>
+        <w:t xml:space="preserve">,</w:t>
+      </w:r>
+      <w:r>
+        <w:rPr>
+          <w:rStyle w:val="DataTypeTok"/>
+        </w:rPr>
+        <w:t xml:space="preserve">"timeframe"</w:t>
+      </w:r>
+      <w:r>
+        <w:rPr>
+          <w:rStyle w:val="FunctionTok"/>
+        </w:rPr>
+        <w:t xml:space="preserve">:</w:t>
+      </w:r>
+      <w:r>
+        <w:rPr>
+          <w:rStyle w:val="StringTok"/>
+        </w:rPr>
+        <w:t xml:space="preserve">"{{interval}}"</w:t>
+      </w:r>
+      <w:r>
+        <w:rPr>
+          <w:rStyle w:val="FunctionTok"/>
+        </w:rPr>
+        <w:t xml:space="preserve">,</w:t>
+      </w:r>
+      <w:r>
+        <w:rPr>
+          <w:rStyle w:val="DataTypeTok"/>
+        </w:rPr>
+        <w:t xml:space="preserve">"entry"</w:t>
+      </w:r>
+      <w:r>
+        <w:rPr>
+          <w:rStyle w:val="FunctionTok"/>
+        </w:rPr>
+        <w:t xml:space="preserve">:{</w:t>
+      </w:r>
+      <w:r>
+        <w:rPr>
+          <w:rStyle w:val="ErrorTok"/>
+        </w:rPr>
+        <w:t xml:space="preserve">{close</w:t>
+      </w:r>
+      <w:r>
+        <w:rPr>
+          <w:rStyle w:val="FunctionTok"/>
+        </w:rPr>
+        <w:t xml:space="preserve">}}</w:t>
+      </w:r>
+      <w:r>
+        <w:rPr>
+          <w:rStyle w:val="ErrorTok"/>
+        </w:rPr>
+        <w:t xml:space="preserve">}</w:t>
+      </w:r>
+    </w:p>
+    <w:p>
+      <w:pPr>
+        <w:pStyle w:val="FirstParagraph"/>
+      </w:pPr>
+      <w:r>
+        <w:rPr>
+          <w:bCs/>
+          <w:b/>
+        </w:rPr>
+        <w:t xml:space="preserve">Payload JSON — Pink × Blue DOWN (venda):</w:t>
+      </w:r>
+    </w:p>
+    <w:p>
+      <w:pPr>
+        <w:pStyle w:val="SourceCode"/>
+      </w:pPr>
+      <w:r>
+        <w:rPr>
+          <w:rStyle w:val="FunctionTok"/>
+        </w:rPr>
+        <w:t xml:space="preserve">{</w:t>
+      </w:r>
+      <w:r>
+        <w:rPr>
+          <w:rStyle w:val="DataTypeTok"/>
+        </w:rPr>
+        <w:t xml:space="preserve">"action"</w:t>
+      </w:r>
+      <w:r>
+        <w:rPr>
+          <w:rStyle w:val="FunctionTok"/>
+        </w:rPr>
+        <w:t xml:space="preserve">:</w:t>
+      </w:r>
+      <w:r>
+        <w:rPr>
+          <w:rStyle w:val="StringTok"/>
+        </w:rPr>
+        <w:t xml:space="preserve">"sell"</w:t>
+      </w:r>
+      <w:r>
+        <w:rPr>
+          <w:rStyle w:val="FunctionTok"/>
+        </w:rPr>
+        <w:t xml:space="preserve">,</w:t>
+      </w:r>
+      <w:r>
+        <w:rPr>
+          <w:rStyle w:val="DataTypeTok"/>
+        </w:rPr>
+        <w:t xml:space="preserve">"timeframe"</w:t>
+      </w:r>
+      <w:r>
+        <w:rPr>
+          <w:rStyle w:val="FunctionTok"/>
+        </w:rPr>
+        <w:t xml:space="preserve">:</w:t>
+      </w:r>
+      <w:r>
+        <w:rPr>
+          <w:rStyle w:val="StringTok"/>
+        </w:rPr>
+        <w:t xml:space="preserve">"{{interval}}"</w:t>
+      </w:r>
+      <w:r>
+        <w:rPr>
+          <w:rStyle w:val="FunctionTok"/>
+        </w:rPr>
+        <w:t xml:space="preserve">,</w:t>
+      </w:r>
+      <w:r>
+        <w:rPr>
+          <w:rStyle w:val="DataTypeTok"/>
+        </w:rPr>
+        <w:t xml:space="preserve">"entry"</w:t>
+      </w:r>
+      <w:r>
+        <w:rPr>
+          <w:rStyle w:val="FunctionTok"/>
+        </w:rPr>
+        <w:t xml:space="preserve">:{</w:t>
+      </w:r>
+      <w:r>
+        <w:rPr>
+          <w:rStyle w:val="ErrorTok"/>
+        </w:rPr>
+        <w:t xml:space="preserve">{close</w:t>
+      </w:r>
+      <w:r>
+        <w:rPr>
+          <w:rStyle w:val="FunctionTok"/>
+        </w:rPr>
+        <w:t xml:space="preserve">}}</w:t>
+      </w:r>
+      <w:r>
+        <w:rPr>
+          <w:rStyle w:val="ErrorTok"/>
+        </w:rPr>
+        <w:t xml:space="preserve">}</w:t>
+      </w:r>
+    </w:p>
+    <w:p>
+      <w:pPr>
+        <w:pStyle w:val="FirstParagraph"/>
+      </w:pPr>
+      <w:r>
+        <w:rPr>
+          <w:bCs/>
+          <w:b/>
+        </w:rPr>
+        <w:t xml:space="preserve">Descrição dos campos:</w:t>
+      </w:r>
+      <w:r>
+        <w:t xml:space="preserve"> </w:t>
+      </w:r>
+      <w:r>
+        <w:t xml:space="preserve">-</w:t>
+      </w:r>
+      <w:r>
+        <w:t xml:space="preserve"> </w:t>
+      </w:r>
+      <w:r>
+        <w:rPr>
+          <w:rStyle w:val="VerbatimChar"/>
+        </w:rPr>
+        <w:t xml:space="preserve">action</w:t>
+      </w:r>
+      <w:r>
+        <w:t xml:space="preserve"> </w:t>
+      </w:r>
+      <w:r>
+        <w:t xml:space="preserve">→</w:t>
+      </w:r>
+      <w:r>
+        <w:t xml:space="preserve"> </w:t>
+      </w:r>
+      <w:r>
+        <w:rPr>
+          <w:bCs/>
+          <w:b/>
+        </w:rPr>
+        <w:t xml:space="preserve">fixo</w:t>
+      </w:r>
+      <w:r>
+        <w:t xml:space="preserve"> </w:t>
+      </w:r>
+      <w:r>
+        <w:t xml:space="preserve">“</w:t>
+      </w:r>
+      <w:r>
+        <w:t xml:space="preserve">buy</w:t>
+      </w:r>
+      <w:r>
+        <w:t xml:space="preserve">”</w:t>
+      </w:r>
+      <w:r>
+        <w:t xml:space="preserve"> </w:t>
+      </w:r>
+      <w:r>
+        <w:t xml:space="preserve">(alerta UP) ou</w:t>
+      </w:r>
+      <w:r>
+        <w:t xml:space="preserve"> </w:t>
+      </w:r>
+      <w:r>
+        <w:t xml:space="preserve">“</w:t>
+      </w:r>
+      <w:r>
+        <w:t xml:space="preserve">sell</w:t>
+      </w:r>
+      <w:r>
+        <w:t xml:space="preserve">”</w:t>
+      </w:r>
+      <w:r>
+        <w:t xml:space="preserve"> </w:t>
+      </w:r>
+      <w:r>
+        <w:t xml:space="preserve">(alerta DOWN)</w:t>
+      </w:r>
+      <w:r>
+        <w:t xml:space="preserve"> </w:t>
+      </w:r>
+      <w:r>
+        <w:t xml:space="preserve">-</w:t>
+      </w:r>
+      <w:r>
+        <w:t xml:space="preserve"> </w:t>
+      </w:r>
+      <w:r>
+        <w:rPr>
+          <w:rStyle w:val="VerbatimChar"/>
+        </w:rPr>
+        <w:t xml:space="preserve">timeframe</w:t>
+      </w:r>
+      <w:r>
+        <w:t xml:space="preserve"> </w:t>
+      </w:r>
+      <w:r>
+        <w:t xml:space="preserve">→</w:t>
+      </w:r>
+      <w:r>
+        <w:t xml:space="preserve"> </w:t>
+      </w:r>
+      <w:r>
+        <w:rPr>
+          <w:rStyle w:val="VerbatimChar"/>
+        </w:rPr>
+        <w:t xml:space="preserve">{{interval}}</w:t>
+      </w:r>
+      <w:r>
+        <w:t xml:space="preserve"> </w:t>
+      </w:r>
+      <w:r>
+        <w:t xml:space="preserve">(placeholder universal — o bot converte automaticamente)</w:t>
+      </w:r>
+      <w:r>
+        <w:t xml:space="preserve"> </w:t>
+      </w:r>
+      <w:r>
+        <w:t xml:space="preserve">-</w:t>
+      </w:r>
+      <w:r>
+        <w:t xml:space="preserve"> </w:t>
+      </w:r>
+      <w:r>
+        <w:rPr>
+          <w:rStyle w:val="VerbatimChar"/>
+        </w:rPr>
+        <w:t xml:space="preserve">entry</w:t>
+      </w:r>
+      <w:r>
+        <w:t xml:space="preserve"> </w:t>
+      </w:r>
+      <w:r>
+        <w:t xml:space="preserve">→</w:t>
+      </w:r>
+      <w:r>
+        <w:t xml:space="preserve"> </w:t>
+      </w:r>
+      <w:r>
+        <w:rPr>
+          <w:rStyle w:val="VerbatimChar"/>
+        </w:rPr>
+        <w:t xml:space="preserve">{{close}}</w:t>
+      </w:r>
+      <w:r>
+        <w:t xml:space="preserve"> </w:t>
+      </w:r>
+      <w:r>
+        <w:t xml:space="preserve">(preço de fechamento da vela; opcional — se faltar, o bot busca o preço público da Bitget)</w:t>
+      </w:r>
+    </w:p>
+    <w:p>
+      <w:pPr>
         <w:pStyle w:val="BodyText"/>
       </w:pPr>
       <w:r>
@@ -389,288 +1020,7 @@
           <w:bCs/>
           <w:b/>
         </w:rPr>
-        <w:t xml:space="preserve">Payload JSON:</w:t>
-      </w:r>
-    </w:p>
-    <w:p>
-      <w:pPr>
-        <w:pStyle w:val="SourceCode"/>
-      </w:pPr>
-      <w:r>
-        <w:rPr>
-          <w:rStyle w:val="FunctionTok"/>
-        </w:rPr>
-        <w:t xml:space="preserve">{</w:t>
-      </w:r>
-      <w:r>
-        <w:br/>
-      </w:r>
-      <w:r>
-        <w:rPr>
-          <w:rStyle w:val="NormalTok"/>
-        </w:rPr>
-        <w:t xml:space="preserve">  </w:t>
-      </w:r>
-      <w:r>
-        <w:rPr>
-          <w:rStyle w:val="DataTypeTok"/>
-        </w:rPr>
-        <w:t xml:space="preserve">"action"</w:t>
-      </w:r>
-      <w:r>
-        <w:rPr>
-          <w:rStyle w:val="FunctionTok"/>
-        </w:rPr>
-        <w:t xml:space="preserve">:</w:t>
-      </w:r>
-      <w:r>
-        <w:rPr>
-          <w:rStyle w:val="NormalTok"/>
-        </w:rPr>
-        <w:t xml:space="preserve"> </w:t>
-      </w:r>
-      <w:r>
-        <w:rPr>
-          <w:rStyle w:val="StringTok"/>
-        </w:rPr>
-        <w:t xml:space="preserve">"{{strategy.order.action}}"</w:t>
-      </w:r>
-      <w:r>
-        <w:rPr>
-          <w:rStyle w:val="FunctionTok"/>
-        </w:rPr>
-        <w:t xml:space="preserve">,</w:t>
-      </w:r>
-      <w:r>
-        <w:br/>
-      </w:r>
-      <w:r>
-        <w:rPr>
-          <w:rStyle w:val="NormalTok"/>
-        </w:rPr>
-        <w:t xml:space="preserve">  </w:t>
-      </w:r>
-      <w:r>
-        <w:rPr>
-          <w:rStyle w:val="DataTypeTok"/>
-        </w:rPr>
-        <w:t xml:space="preserve">"timeframe"</w:t>
-      </w:r>
-      <w:r>
-        <w:rPr>
-          <w:rStyle w:val="FunctionTok"/>
-        </w:rPr>
-        <w:t xml:space="preserve">:</w:t>
-      </w:r>
-      <w:r>
-        <w:rPr>
-          <w:rStyle w:val="NormalTok"/>
-        </w:rPr>
-        <w:t xml:space="preserve"> </w:t>
-      </w:r>
-      <w:r>
-        <w:rPr>
-          <w:rStyle w:val="StringTok"/>
-        </w:rPr>
-        <w:t xml:space="preserve">"{{interval}}"</w:t>
-      </w:r>
-      <w:r>
-        <w:rPr>
-          <w:rStyle w:val="FunctionTok"/>
-        </w:rPr>
-        <w:t xml:space="preserve">,</w:t>
-      </w:r>
-      <w:r>
-        <w:br/>
-      </w:r>
-      <w:r>
-        <w:rPr>
-          <w:rStyle w:val="NormalTok"/>
-        </w:rPr>
-        <w:t xml:space="preserve">  </w:t>
-      </w:r>
-      <w:r>
-        <w:rPr>
-          <w:rStyle w:val="DataTypeTok"/>
-        </w:rPr>
-        <w:t xml:space="preserve">"rsi"</w:t>
-      </w:r>
-      <w:r>
-        <w:rPr>
-          <w:rStyle w:val="FunctionTok"/>
-        </w:rPr>
-        <w:t xml:space="preserve">:</w:t>
-      </w:r>
-      <w:r>
-        <w:rPr>
-          <w:rStyle w:val="NormalTok"/>
-        </w:rPr>
-        <w:t xml:space="preserve"> </w:t>
-      </w:r>
-      <w:r>
-        <w:rPr>
-          <w:rStyle w:val="FunctionTok"/>
-        </w:rPr>
-        <w:t xml:space="preserve">{</w:t>
-      </w:r>
-      <w:r>
-        <w:rPr>
-          <w:rStyle w:val="ErrorTok"/>
-        </w:rPr>
-        <w:t xml:space="preserve">{plot(</w:t>
-      </w:r>
-      <w:r>
-        <w:rPr>
-          <w:rStyle w:val="DataTypeTok"/>
-        </w:rPr>
-        <w:t xml:space="preserve">"RSI"</w:t>
-      </w:r>
-      <w:r>
-        <w:rPr>
-          <w:rStyle w:val="ErrorTok"/>
-        </w:rPr>
-        <w:t xml:space="preserve">)</w:t>
-      </w:r>
-      <w:r>
-        <w:rPr>
-          <w:rStyle w:val="FunctionTok"/>
-        </w:rPr>
-        <w:t xml:space="preserve">}}</w:t>
-      </w:r>
-      <w:r>
-        <w:rPr>
-          <w:rStyle w:val="ErrorTok"/>
-        </w:rPr>
-        <w:t xml:space="preserve">,</w:t>
-      </w:r>
-      <w:r>
-        <w:br/>
-      </w:r>
-      <w:r>
-        <w:rPr>
-          <w:rStyle w:val="NormalTok"/>
-        </w:rPr>
-        <w:t xml:space="preserve">  </w:t>
-      </w:r>
-      <w:r>
-        <w:rPr>
-          <w:rStyle w:val="ErrorTok"/>
-        </w:rPr>
-        <w:t xml:space="preserve">"rsi_ma":</w:t>
-      </w:r>
-      <w:r>
-        <w:rPr>
-          <w:rStyle w:val="NormalTok"/>
-        </w:rPr>
-        <w:t xml:space="preserve"> </w:t>
-      </w:r>
-      <w:r>
-        <w:rPr>
-          <w:rStyle w:val="FunctionTok"/>
-        </w:rPr>
-        <w:t xml:space="preserve">{</w:t>
-      </w:r>
-      <w:r>
-        <w:rPr>
-          <w:rStyle w:val="ErrorTok"/>
-        </w:rPr>
-        <w:t xml:space="preserve">{plot(</w:t>
-      </w:r>
-      <w:r>
-        <w:rPr>
-          <w:rStyle w:val="DataTypeTok"/>
-        </w:rPr>
-        <w:t xml:space="preserve">"RSI_MA"</w:t>
-      </w:r>
-      <w:r>
-        <w:rPr>
-          <w:rStyle w:val="ErrorTok"/>
-        </w:rPr>
-        <w:t xml:space="preserve">)</w:t>
-      </w:r>
-      <w:r>
-        <w:rPr>
-          <w:rStyle w:val="FunctionTok"/>
-        </w:rPr>
-        <w:t xml:space="preserve">}</w:t>
-      </w:r>
-      <w:r>
-        <w:rPr>
-          <w:rStyle w:val="ErrorTok"/>
-        </w:rPr>
-        <w:t xml:space="preserve">},</w:t>
-      </w:r>
-      <w:r>
-        <w:br/>
-      </w:r>
-      <w:r>
-        <w:rPr>
-          <w:rStyle w:val="NormalTok"/>
-        </w:rPr>
-        <w:t xml:space="preserve">  </w:t>
-      </w:r>
-      <w:r>
-        <w:rPr>
-          <w:rStyle w:val="ErrorTok"/>
-        </w:rPr>
-        <w:t xml:space="preserve">"entry":</w:t>
-      </w:r>
-      <w:r>
-        <w:rPr>
-          <w:rStyle w:val="NormalTok"/>
-        </w:rPr>
-        <w:t xml:space="preserve"> </w:t>
-      </w:r>
-      <w:r>
-        <w:rPr>
-          <w:rStyle w:val="FunctionTok"/>
-        </w:rPr>
-        <w:t xml:space="preserve">{</w:t>
-      </w:r>
-      <w:r>
-        <w:rPr>
-          <w:rStyle w:val="ErrorTok"/>
-        </w:rPr>
-        <w:t xml:space="preserve">{close</w:t>
-      </w:r>
-      <w:r>
-        <w:rPr>
-          <w:rStyle w:val="FunctionTok"/>
-        </w:rPr>
-        <w:t xml:space="preserve">}</w:t>
-      </w:r>
-      <w:r>
-        <w:rPr>
-          <w:rStyle w:val="ErrorTok"/>
-        </w:rPr>
-        <w:t xml:space="preserve">}</w:t>
-      </w:r>
-      <w:r>
-        <w:br/>
-      </w:r>
-      <w:r>
-        <w:rPr>
-          <w:rStyle w:val="ErrorTok"/>
-        </w:rPr>
-        <w:t xml:space="preserve">}</w:t>
-      </w:r>
-    </w:p>
-    <w:p>
-      <w:pPr>
-        <w:pStyle w:val="FirstParagraph"/>
-      </w:pPr>
-      <w:r>
-        <w:rPr>
-          <w:bCs/>
-          <w:b/>
-        </w:rPr>
-        <w:t xml:space="preserve">Descrição dos campos:</w:t>
-      </w:r>
-      <w:r>
-        <w:t xml:space="preserve"> </w:t>
-      </w:r>
-      <w:r>
-        <w:t xml:space="preserve">-</w:t>
+        <w:t xml:space="preserve">Campos opcionais:</w:t>
       </w:r>
       <w:r>
         <w:t xml:space="preserve"> </w:t>
@@ -679,55 +1029,13 @@
         <w:rPr>
           <w:rStyle w:val="VerbatimChar"/>
         </w:rPr>
-        <w:t xml:space="preserve">action</w:t>
-      </w:r>
-      <w:r>
-        <w:t xml:space="preserve"> </w:t>
-      </w:r>
-      <w:r>
-        <w:t xml:space="preserve">→</w:t>
-      </w:r>
-      <w:r>
-        <w:t xml:space="preserve"> </w:t>
-      </w:r>
-      <w:r>
-        <w:t xml:space="preserve">“</w:t>
-      </w:r>
-      <w:r>
-        <w:t xml:space="preserve">buy</w:t>
-      </w:r>
-      <w:r>
-        <w:t xml:space="preserve">”</w:t>
-      </w:r>
-      <w:r>
-        <w:t xml:space="preserve"> </w:t>
-      </w:r>
-      <w:r>
-        <w:t xml:space="preserve">ou</w:t>
-      </w:r>
-      <w:r>
-        <w:t xml:space="preserve"> </w:t>
-      </w:r>
-      <w:r>
-        <w:t xml:space="preserve">“</w:t>
-      </w:r>
-      <w:r>
-        <w:t xml:space="preserve">sell</w:t>
-      </w:r>
-      <w:r>
-        <w:t xml:space="preserve">”</w:t>
-      </w:r>
-      <w:r>
-        <w:t xml:space="preserve"> </w:t>
-      </w:r>
-      <w:r>
-        <w:t xml:space="preserve">(gerado pelo indicador TSTS Sniper)</w:t>
-      </w:r>
-      <w:r>
-        <w:t xml:space="preserve"> </w:t>
-      </w:r>
-      <w:r>
-        <w:t xml:space="preserve">-</w:t>
+        <w:t xml:space="preserve">rsi</w:t>
+      </w:r>
+      <w:r>
+        <w:t xml:space="preserve"> </w:t>
+      </w:r>
+      <w:r>
+        <w:t xml:space="preserve">e</w:t>
       </w:r>
       <w:r>
         <w:t xml:space="preserve"> </w:t>
@@ -736,127 +1044,23 @@
         <w:rPr>
           <w:rStyle w:val="VerbatimChar"/>
         </w:rPr>
-        <w:t xml:space="preserve">timeframe</w:t>
-      </w:r>
-      <w:r>
-        <w:t xml:space="preserve"> </w:t>
-      </w:r>
-      <w:r>
-        <w:t xml:space="preserve">→</w:t>
-      </w:r>
-      <w:r>
-        <w:t xml:space="preserve"> </w:t>
-      </w:r>
-      <w:r>
-        <w:t xml:space="preserve">“</w:t>
-      </w:r>
-      <w:r>
-        <w:t xml:space="preserve">1</w:t>
-      </w:r>
-      <w:r>
-        <w:t xml:space="preserve">”</w:t>
-      </w:r>
-      <w:r>
-        <w:t xml:space="preserve">,</w:t>
-      </w:r>
-      <w:r>
-        <w:t xml:space="preserve"> </w:t>
-      </w:r>
-      <w:r>
-        <w:t xml:space="preserve">“</w:t>
-      </w:r>
-      <w:r>
-        <w:t xml:space="preserve">5</w:t>
-      </w:r>
-      <w:r>
-        <w:t xml:space="preserve">”</w:t>
-      </w:r>
-      <w:r>
-        <w:t xml:space="preserve"> </w:t>
-      </w:r>
-      <w:r>
-        <w:t xml:space="preserve">ou</w:t>
-      </w:r>
-      <w:r>
-        <w:t xml:space="preserve"> </w:t>
-      </w:r>
-      <w:r>
-        <w:t xml:space="preserve">“</w:t>
-      </w:r>
-      <w:r>
-        <w:t xml:space="preserve">15</w:t>
-      </w:r>
-      <w:r>
-        <w:t xml:space="preserve">”</w:t>
-      </w:r>
-      <w:r>
-        <w:t xml:space="preserve"> </w:t>
-      </w:r>
-      <w:r>
-        <w:t xml:space="preserve">(em minutos, o bot converte automaticamente)</w:t>
-      </w:r>
-      <w:r>
-        <w:t xml:space="preserve"> </w:t>
-      </w:r>
-      <w:r>
-        <w:t xml:space="preserve">-</w:t>
-      </w:r>
-      <w:r>
-        <w:t xml:space="preserve"> </w:t>
-      </w:r>
-      <w:r>
-        <w:rPr>
-          <w:rStyle w:val="VerbatimChar"/>
-        </w:rPr>
-        <w:t xml:space="preserve">rsi</w:t>
-      </w:r>
-      <w:r>
-        <w:t xml:space="preserve"> </w:t>
-      </w:r>
-      <w:r>
-        <w:t xml:space="preserve">→ valor atual do RSI(14)</w:t>
-      </w:r>
-      <w:r>
-        <w:t xml:space="preserve"> </w:t>
-      </w:r>
-      <w:r>
-        <w:t xml:space="preserve">-</w:t>
-      </w:r>
-      <w:r>
-        <w:t xml:space="preserve"> </w:t>
-      </w:r>
-      <w:r>
-        <w:rPr>
-          <w:rStyle w:val="VerbatimChar"/>
-        </w:rPr>
         <w:t xml:space="preserve">rsi_ma</w:t>
       </w:r>
       <w:r>
         <w:t xml:space="preserve"> </w:t>
       </w:r>
       <w:r>
-        <w:t xml:space="preserve">→ valor atual da média do RSI(14)</w:t>
-      </w:r>
-      <w:r>
-        <w:t xml:space="preserve"> </w:t>
-      </w:r>
-      <w:r>
-        <w:t xml:space="preserve">-</w:t>
-      </w:r>
-      <w:r>
-        <w:t xml:space="preserve"> </w:t>
-      </w:r>
-      <w:r>
-        <w:rPr>
-          <w:rStyle w:val="VerbatimChar"/>
-        </w:rPr>
-        <w:t xml:space="preserve">entry</w:t>
-      </w:r>
-      <w:r>
-        <w:t xml:space="preserve"> </w:t>
-      </w:r>
-      <w:r>
-        <w:t xml:space="preserve">→ preço de fechamento da vela</w:t>
+        <w:rPr>
+          <w:bCs/>
+          <w:b/>
+        </w:rPr>
+        <w:t xml:space="preserve">não são necessários</w:t>
+      </w:r>
+      <w:r>
+        <w:t xml:space="preserve"> </w:t>
+      </w:r>
+      <w:r>
+        <w:t xml:space="preserve">e devem ser omitidos (evita o erro de JSON).</w:t>
       </w:r>
     </w:p>
     <w:p>
@@ -969,15 +1173,6 @@
         <w:t xml:space="preserve">{</w:t>
       </w:r>
       <w:r>
-        <w:br/>
-      </w:r>
-      <w:r>
-        <w:rPr>
-          <w:rStyle w:val="NormalTok"/>
-        </w:rPr>
-        <w:t xml:space="preserve">  </w:t>
-      </w:r>
-      <w:r>
         <w:rPr>
           <w:rStyle w:val="DataTypeTok"/>
         </w:rPr>
@@ -991,12 +1186,6 @@
       </w:r>
       <w:r>
         <w:rPr>
-          <w:rStyle w:val="NormalTok"/>
-        </w:rPr>
-        <w:t xml:space="preserve"> </w:t>
-      </w:r>
-      <w:r>
-        <w:rPr>
           <w:rStyle w:val="StringTok"/>
         </w:rPr>
         <w:t xml:space="preserve">"up"</w:t>
@@ -1008,15 +1197,6 @@
         <w:t xml:space="preserve">,</w:t>
       </w:r>
       <w:r>
-        <w:br/>
-      </w:r>
-      <w:r>
-        <w:rPr>
-          <w:rStyle w:val="NormalTok"/>
-        </w:rPr>
-        <w:t xml:space="preserve">  </w:t>
-      </w:r>
-      <w:r>
         <w:rPr>
           <w:rStyle w:val="DataTypeTok"/>
         </w:rPr>
@@ -1030,12 +1210,6 @@
       </w:r>
       <w:r>
         <w:rPr>
-          <w:rStyle w:val="NormalTok"/>
-        </w:rPr>
-        <w:t xml:space="preserve"> </w:t>
-      </w:r>
-      <w:r>
-        <w:rPr>
           <w:rStyle w:val="StringTok"/>
         </w:rPr>
         <w:t xml:space="preserve">"{{interval}}"</w:t>
@@ -1044,22 +1218,60 @@
         <w:rPr>
           <w:rStyle w:val="FunctionTok"/>
         </w:rPr>
+        <w:t xml:space="preserve">}</w:t>
+      </w:r>
+    </w:p>
+    <w:p>
+      <w:pPr>
+        <w:pStyle w:val="FirstParagraph"/>
+      </w:pPr>
+      <w:r>
+        <w:rPr>
+          <w:bCs/>
+          <w:b/>
+        </w:rPr>
+        <w:t xml:space="preserve">Payload JSON (RSI cruza pra baixo):</w:t>
+      </w:r>
+    </w:p>
+    <w:p>
+      <w:pPr>
+        <w:pStyle w:val="SourceCode"/>
+      </w:pPr>
+      <w:r>
+        <w:rPr>
+          <w:rStyle w:val="FunctionTok"/>
+        </w:rPr>
+        <w:t xml:space="preserve">{</w:t>
+      </w:r>
+      <w:r>
+        <w:rPr>
+          <w:rStyle w:val="DataTypeTok"/>
+        </w:rPr>
+        <w:t xml:space="preserve">"direction"</w:t>
+      </w:r>
+      <w:r>
+        <w:rPr>
+          <w:rStyle w:val="FunctionTok"/>
+        </w:rPr>
+        <w:t xml:space="preserve">:</w:t>
+      </w:r>
+      <w:r>
+        <w:rPr>
+          <w:rStyle w:val="StringTok"/>
+        </w:rPr>
+        <w:t xml:space="preserve">"down"</w:t>
+      </w:r>
+      <w:r>
+        <w:rPr>
+          <w:rStyle w:val="FunctionTok"/>
+        </w:rPr>
         <w:t xml:space="preserve">,</w:t>
       </w:r>
       <w:r>
-        <w:br/>
-      </w:r>
-      <w:r>
-        <w:rPr>
-          <w:rStyle w:val="NormalTok"/>
-        </w:rPr>
-        <w:t xml:space="preserve">  </w:t>
-      </w:r>
-      <w:r>
         <w:rPr>
           <w:rStyle w:val="DataTypeTok"/>
         </w:rPr>
-        <w:t xml:space="preserve">"rsi"</w:t>
+        <w:t xml:space="preserve">"timeframe"</w:t>
       </w:r>
       <w:r>
         <w:rPr>
@@ -1069,112 +1281,16 @@
       </w:r>
       <w:r>
         <w:rPr>
-          <w:rStyle w:val="NormalTok"/>
-        </w:rPr>
-        <w:t xml:space="preserve"> </w:t>
+          <w:rStyle w:val="StringTok"/>
+        </w:rPr>
+        <w:t xml:space="preserve">"{{interval}}"</w:t>
       </w:r>
       <w:r>
         <w:rPr>
           <w:rStyle w:val="FunctionTok"/>
         </w:rPr>
-        <w:t xml:space="preserve">{</w:t>
-      </w:r>
-      <w:r>
-        <w:rPr>
-          <w:rStyle w:val="ErrorTok"/>
-        </w:rPr>
-        <w:t xml:space="preserve">{plot(</w:t>
-      </w:r>
-      <w:r>
-        <w:rPr>
-          <w:rStyle w:val="DataTypeTok"/>
-        </w:rPr>
-        <w:t xml:space="preserve">"RSI"</w:t>
-      </w:r>
-      <w:r>
-        <w:rPr>
-          <w:rStyle w:val="ErrorTok"/>
-        </w:rPr>
-        <w:t xml:space="preserve">)</w:t>
-      </w:r>
-      <w:r>
-        <w:rPr>
-          <w:rStyle w:val="FunctionTok"/>
-        </w:rPr>
-        <w:t xml:space="preserve">}}</w:t>
-      </w:r>
-      <w:r>
-        <w:rPr>
-          <w:rStyle w:val="ErrorTok"/>
-        </w:rPr>
-        <w:t xml:space="preserve">,</w:t>
-      </w:r>
-      <w:r>
-        <w:br/>
-      </w:r>
-      <w:r>
-        <w:rPr>
-          <w:rStyle w:val="NormalTok"/>
-        </w:rPr>
-        <w:t xml:space="preserve">  </w:t>
-      </w:r>
-      <w:r>
-        <w:rPr>
-          <w:rStyle w:val="ErrorTok"/>
-        </w:rPr>
-        <w:t xml:space="preserve">"rsi_ma":</w:t>
-      </w:r>
-      <w:r>
-        <w:rPr>
-          <w:rStyle w:val="NormalTok"/>
-        </w:rPr>
-        <w:t xml:space="preserve"> </w:t>
-      </w:r>
-      <w:r>
-        <w:rPr>
-          <w:rStyle w:val="FunctionTok"/>
-        </w:rPr>
-        <w:t xml:space="preserve">{</w:t>
-      </w:r>
-      <w:r>
-        <w:rPr>
-          <w:rStyle w:val="ErrorTok"/>
-        </w:rPr>
-        <w:t xml:space="preserve">{plot(</w:t>
-      </w:r>
-      <w:r>
-        <w:rPr>
-          <w:rStyle w:val="DataTypeTok"/>
-        </w:rPr>
-        <w:t xml:space="preserve">"RSI_MA"</w:t>
-      </w:r>
-      <w:r>
-        <w:rPr>
-          <w:rStyle w:val="ErrorTok"/>
-        </w:rPr>
-        <w:t xml:space="preserve">)</w:t>
-      </w:r>
-      <w:r>
-        <w:rPr>
-          <w:rStyle w:val="FunctionTok"/>
-        </w:rPr>
         <w:t xml:space="preserve">}</w:t>
       </w:r>
-      <w:r>
-        <w:rPr>
-          <w:rStyle w:val="ErrorTok"/>
-        </w:rPr>
-        <w:t xml:space="preserve">}</w:t>
-      </w:r>
-      <w:r>
-        <w:br/>
-      </w:r>
-      <w:r>
-        <w:rPr>
-          <w:rStyle w:val="ErrorTok"/>
-        </w:rPr>
-        <w:t xml:space="preserve">}</w:t>
-      </w:r>
     </w:p>
     <w:p>
       <w:pPr>
@@ -1185,236 +1301,6 @@
           <w:bCs/>
           <w:b/>
         </w:rPr>
-        <w:t xml:space="preserve">Payload JSON (RSI cruza pra baixo):</w:t>
-      </w:r>
-    </w:p>
-    <w:p>
-      <w:pPr>
-        <w:pStyle w:val="SourceCode"/>
-      </w:pPr>
-      <w:r>
-        <w:rPr>
-          <w:rStyle w:val="FunctionTok"/>
-        </w:rPr>
-        <w:t xml:space="preserve">{</w:t>
-      </w:r>
-      <w:r>
-        <w:br/>
-      </w:r>
-      <w:r>
-        <w:rPr>
-          <w:rStyle w:val="NormalTok"/>
-        </w:rPr>
-        <w:t xml:space="preserve">  </w:t>
-      </w:r>
-      <w:r>
-        <w:rPr>
-          <w:rStyle w:val="DataTypeTok"/>
-        </w:rPr>
-        <w:t xml:space="preserve">"direction"</w:t>
-      </w:r>
-      <w:r>
-        <w:rPr>
-          <w:rStyle w:val="FunctionTok"/>
-        </w:rPr>
-        <w:t xml:space="preserve">:</w:t>
-      </w:r>
-      <w:r>
-        <w:rPr>
-          <w:rStyle w:val="NormalTok"/>
-        </w:rPr>
-        <w:t xml:space="preserve"> </w:t>
-      </w:r>
-      <w:r>
-        <w:rPr>
-          <w:rStyle w:val="StringTok"/>
-        </w:rPr>
-        <w:t xml:space="preserve">"down"</w:t>
-      </w:r>
-      <w:r>
-        <w:rPr>
-          <w:rStyle w:val="FunctionTok"/>
-        </w:rPr>
-        <w:t xml:space="preserve">,</w:t>
-      </w:r>
-      <w:r>
-        <w:br/>
-      </w:r>
-      <w:r>
-        <w:rPr>
-          <w:rStyle w:val="NormalTok"/>
-        </w:rPr>
-        <w:t xml:space="preserve">  </w:t>
-      </w:r>
-      <w:r>
-        <w:rPr>
-          <w:rStyle w:val="DataTypeTok"/>
-        </w:rPr>
-        <w:t xml:space="preserve">"timeframe"</w:t>
-      </w:r>
-      <w:r>
-        <w:rPr>
-          <w:rStyle w:val="FunctionTok"/>
-        </w:rPr>
-        <w:t xml:space="preserve">:</w:t>
-      </w:r>
-      <w:r>
-        <w:rPr>
-          <w:rStyle w:val="NormalTok"/>
-        </w:rPr>
-        <w:t xml:space="preserve"> </w:t>
-      </w:r>
-      <w:r>
-        <w:rPr>
-          <w:rStyle w:val="StringTok"/>
-        </w:rPr>
-        <w:t xml:space="preserve">"{{interval}}"</w:t>
-      </w:r>
-      <w:r>
-        <w:rPr>
-          <w:rStyle w:val="FunctionTok"/>
-        </w:rPr>
-        <w:t xml:space="preserve">,</w:t>
-      </w:r>
-      <w:r>
-        <w:br/>
-      </w:r>
-      <w:r>
-        <w:rPr>
-          <w:rStyle w:val="NormalTok"/>
-        </w:rPr>
-        <w:t xml:space="preserve">  </w:t>
-      </w:r>
-      <w:r>
-        <w:rPr>
-          <w:rStyle w:val="DataTypeTok"/>
-        </w:rPr>
-        <w:t xml:space="preserve">"rsi"</w:t>
-      </w:r>
-      <w:r>
-        <w:rPr>
-          <w:rStyle w:val="FunctionTok"/>
-        </w:rPr>
-        <w:t xml:space="preserve">:</w:t>
-      </w:r>
-      <w:r>
-        <w:rPr>
-          <w:rStyle w:val="NormalTok"/>
-        </w:rPr>
-        <w:t xml:space="preserve"> </w:t>
-      </w:r>
-      <w:r>
-        <w:rPr>
-          <w:rStyle w:val="FunctionTok"/>
-        </w:rPr>
-        <w:t xml:space="preserve">{</w:t>
-      </w:r>
-      <w:r>
-        <w:rPr>
-          <w:rStyle w:val="ErrorTok"/>
-        </w:rPr>
-        <w:t xml:space="preserve">{plot(</w:t>
-      </w:r>
-      <w:r>
-        <w:rPr>
-          <w:rStyle w:val="DataTypeTok"/>
-        </w:rPr>
-        <w:t xml:space="preserve">"RSI"</w:t>
-      </w:r>
-      <w:r>
-        <w:rPr>
-          <w:rStyle w:val="ErrorTok"/>
-        </w:rPr>
-        <w:t xml:space="preserve">)</w:t>
-      </w:r>
-      <w:r>
-        <w:rPr>
-          <w:rStyle w:val="FunctionTok"/>
-        </w:rPr>
-        <w:t xml:space="preserve">}}</w:t>
-      </w:r>
-      <w:r>
-        <w:rPr>
-          <w:rStyle w:val="ErrorTok"/>
-        </w:rPr>
-        <w:t xml:space="preserve">,</w:t>
-      </w:r>
-      <w:r>
-        <w:br/>
-      </w:r>
-      <w:r>
-        <w:rPr>
-          <w:rStyle w:val="NormalTok"/>
-        </w:rPr>
-        <w:t xml:space="preserve">  </w:t>
-      </w:r>
-      <w:r>
-        <w:rPr>
-          <w:rStyle w:val="ErrorTok"/>
-        </w:rPr>
-        <w:t xml:space="preserve">"rsi_ma":</w:t>
-      </w:r>
-      <w:r>
-        <w:rPr>
-          <w:rStyle w:val="NormalTok"/>
-        </w:rPr>
-        <w:t xml:space="preserve"> </w:t>
-      </w:r>
-      <w:r>
-        <w:rPr>
-          <w:rStyle w:val="FunctionTok"/>
-        </w:rPr>
-        <w:t xml:space="preserve">{</w:t>
-      </w:r>
-      <w:r>
-        <w:rPr>
-          <w:rStyle w:val="ErrorTok"/>
-        </w:rPr>
-        <w:t xml:space="preserve">{plot(</w:t>
-      </w:r>
-      <w:r>
-        <w:rPr>
-          <w:rStyle w:val="DataTypeTok"/>
-        </w:rPr>
-        <w:t xml:space="preserve">"RSI_MA"</w:t>
-      </w:r>
-      <w:r>
-        <w:rPr>
-          <w:rStyle w:val="ErrorTok"/>
-        </w:rPr>
-        <w:t xml:space="preserve">)</w:t>
-      </w:r>
-      <w:r>
-        <w:rPr>
-          <w:rStyle w:val="FunctionTok"/>
-        </w:rPr>
-        <w:t xml:space="preserve">}</w:t>
-      </w:r>
-      <w:r>
-        <w:rPr>
-          <w:rStyle w:val="ErrorTok"/>
-        </w:rPr>
-        <w:t xml:space="preserve">}</w:t>
-      </w:r>
-      <w:r>
-        <w:br/>
-      </w:r>
-      <w:r>
-        <w:rPr>
-          <w:rStyle w:val="ErrorTok"/>
-        </w:rPr>
-        <w:t xml:space="preserve">}</w:t>
-      </w:r>
-    </w:p>
-    <w:p>
-      <w:pPr>
-        <w:pStyle w:val="FirstParagraph"/>
-      </w:pPr>
-      <w:r>
-        <w:rPr>
-          <w:bCs/>
-          <w:b/>
-        </w:rPr>
         <w:t xml:space="preserve">Descrição dos campos:</w:t>
       </w:r>
       <w:r>
@@ -1442,6 +1328,16 @@
         <w:t xml:space="preserve"> </w:t>
       </w:r>
       <w:r>
+        <w:rPr>
+          <w:bCs/>
+          <w:b/>
+        </w:rPr>
+        <w:t xml:space="preserve">fixo</w:t>
+      </w:r>
+      <w:r>
+        <w:t xml:space="preserve"> </w:t>
+      </w:r>
+      <w:r>
         <w:t xml:space="preserve">“</w:t>
       </w:r>
       <w:r>
@@ -1499,94 +1395,106 @@
         <w:t xml:space="preserve"> </w:t>
       </w:r>
       <w:r>
-        <w:t xml:space="preserve">“</w:t>
-      </w:r>
-      <w:r>
-        <w:t xml:space="preserve">1</w:t>
-      </w:r>
-      <w:r>
-        <w:t xml:space="preserve">”</w:t>
-      </w:r>
-      <w:r>
-        <w:t xml:space="preserve">,</w:t>
-      </w:r>
-      <w:r>
-        <w:t xml:space="preserve"> </w:t>
-      </w:r>
-      <w:r>
-        <w:t xml:space="preserve">“</w:t>
-      </w:r>
-      <w:r>
-        <w:t xml:space="preserve">5</w:t>
-      </w:r>
-      <w:r>
-        <w:t xml:space="preserve">”</w:t>
-      </w:r>
-      <w:r>
-        <w:t xml:space="preserve"> </w:t>
-      </w:r>
-      <w:r>
-        <w:t xml:space="preserve">ou</w:t>
-      </w:r>
-      <w:r>
-        <w:t xml:space="preserve"> </w:t>
-      </w:r>
-      <w:r>
-        <w:t xml:space="preserve">“</w:t>
-      </w:r>
-      <w:r>
-        <w:t xml:space="preserve">15</w:t>
-      </w:r>
-      <w:r>
-        <w:t xml:space="preserve">”</w:t>
-      </w:r>
-      <w:r>
-        <w:t xml:space="preserve"> </w:t>
-      </w:r>
-      <w:r>
-        <w:t xml:space="preserve">(em minutos)</w:t>
-      </w:r>
-      <w:r>
-        <w:t xml:space="preserve"> </w:t>
-      </w:r>
-      <w:r>
-        <w:t xml:space="preserve">-</w:t>
-      </w:r>
-      <w:r>
-        <w:t xml:space="preserve"> </w:t>
-      </w:r>
-      <w:r>
         <w:rPr>
           <w:rStyle w:val="VerbatimChar"/>
         </w:rPr>
+        <w:t xml:space="preserve">{{interval}}</w:t>
+      </w:r>
+      <w:r>
+        <w:t xml:space="preserve"> </w:t>
+      </w:r>
+      <w:r>
+        <w:t xml:space="preserve">(placeholder universal)</w:t>
+      </w:r>
+    </w:p>
+    <w:p>
+      <w:pPr>
+        <w:pStyle w:val="BlockText"/>
+      </w:pPr>
+      <w:r>
+        <w:t xml:space="preserve">⚠️</w:t>
+      </w:r>
+      <w:r>
+        <w:t xml:space="preserve"> </w:t>
+      </w:r>
+      <w:r>
+        <w:rPr>
+          <w:bCs/>
+          <w:b/>
+        </w:rPr>
+        <w:t xml:space="preserve">Não inclua</w:t>
+      </w:r>
+      <w:r>
+        <w:rPr>
+          <w:bCs/>
+          <w:b/>
+        </w:rPr>
+        <w:t xml:space="preserve"> </w:t>
+      </w:r>
+      <w:r>
+        <w:rPr>
+          <w:rStyle w:val="VerbatimChar"/>
+          <w:bCs/>
+          <w:b/>
+        </w:rPr>
         <w:t xml:space="preserve">rsi</w:t>
       </w:r>
       <w:r>
-        <w:t xml:space="preserve"> </w:t>
-      </w:r>
-      <w:r>
-        <w:t xml:space="preserve">→ valor atual do RSI(14)</w:t>
-      </w:r>
-      <w:r>
-        <w:t xml:space="preserve"> </w:t>
-      </w:r>
-      <w:r>
-        <w:t xml:space="preserve">-</w:t>
-      </w:r>
-      <w:r>
-        <w:t xml:space="preserve"> </w:t>
+        <w:rPr>
+          <w:bCs/>
+          <w:b/>
+        </w:rPr>
+        <w:t xml:space="preserve">/</w:t>
       </w:r>
       <w:r>
         <w:rPr>
           <w:rStyle w:val="VerbatimChar"/>
+          <w:bCs/>
+          <w:b/>
         </w:rPr>
         <w:t xml:space="preserve">rsi_ma</w:t>
       </w:r>
       <w:r>
-        <w:t xml:space="preserve"> </w:t>
-      </w:r>
-      <w:r>
-        <w:t xml:space="preserve">→ valor atual da média do RSI(14)</w:t>
+        <w:rPr>
+          <w:bCs/>
+          <w:b/>
+        </w:rPr>
+        <w:t xml:space="preserve"> </w:t>
+      </w:r>
+      <w:r>
+        <w:rPr>
+          <w:bCs/>
+          <w:b/>
+        </w:rPr>
+        <w:t xml:space="preserve">com</w:t>
+      </w:r>
+      <w:r>
+        <w:rPr>
+          <w:bCs/>
+          <w:b/>
+        </w:rPr>
+        <w:t xml:space="preserve"> </w:t>
+      </w:r>
+      <w:r>
+        <w:rPr>
+          <w:rStyle w:val="VerbatimChar"/>
+          <w:bCs/>
+          <w:b/>
+        </w:rPr>
+        <w:t xml:space="preserve">{{plot(...)}}</w:t>
+      </w:r>
+      <w:r>
+        <w:rPr>
+          <w:bCs/>
+          <w:b/>
+        </w:rPr>
+        <w:t xml:space="preserve">.</w:t>
+      </w:r>
+      <w:r>
+        <w:t xml:space="preserve"> </w:t>
+      </w:r>
+      <w:r>
+        <w:t xml:space="preserve">Se o seu indicador de RSI não expuser esses plots com esse nome exato, o campo fica vazio e quebra o JSON. Esses valores são opcionais para o bot.</w:t>
       </w:r>
     </w:p>
     <w:p>
@@ -2004,6 +1912,28 @@
         </w:rPr>
         <w:t xml:space="preserve">Message (payload JSON):</w:t>
       </w:r>
+      <w:r>
+        <w:t xml:space="preserve"> </w:t>
+      </w:r>
+      <w:r>
+        <w:t xml:space="preserve">— para o alerta de cruzamento</w:t>
+      </w:r>
+      <w:r>
+        <w:t xml:space="preserve"> </w:t>
+      </w:r>
+      <w:r>
+        <w:rPr>
+          <w:bCs/>
+          <w:b/>
+        </w:rPr>
+        <w:t xml:space="preserve">pra cima</w:t>
+      </w:r>
+      <w:r>
+        <w:t xml:space="preserve"> </w:t>
+      </w:r>
+      <w:r>
+        <w:t xml:space="preserve">(compra):</w:t>
+      </w:r>
     </w:p>
     <w:p>
       <w:pPr>
@@ -2020,15 +1950,6 @@
         <w:t xml:space="preserve">{</w:t>
       </w:r>
       <w:r>
-        <w:br/>
-      </w:r>
-      <w:r>
-        <w:rPr>
-          <w:rStyle w:val="NormalTok"/>
-        </w:rPr>
-        <w:t xml:space="preserve">  </w:t>
-      </w:r>
-      <w:r>
         <w:rPr>
           <w:rStyle w:val="DataTypeTok"/>
         </w:rPr>
@@ -2042,15 +1963,9 @@
       </w:r>
       <w:r>
         <w:rPr>
-          <w:rStyle w:val="NormalTok"/>
-        </w:rPr>
-        <w:t xml:space="preserve"> </w:t>
-      </w:r>
-      <w:r>
-        <w:rPr>
           <w:rStyle w:val="StringTok"/>
         </w:rPr>
-        <w:t xml:space="preserve">"{{strategy.order.action}}"</w:t>
+        <w:t xml:space="preserve">"buy"</w:t>
       </w:r>
       <w:r>
         <w:rPr>
@@ -2059,15 +1974,6 @@
         <w:t xml:space="preserve">,</w:t>
       </w:r>
       <w:r>
-        <w:br/>
-      </w:r>
-      <w:r>
-        <w:rPr>
-          <w:rStyle w:val="NormalTok"/>
-        </w:rPr>
-        <w:t xml:space="preserve">  </w:t>
-      </w:r>
-      <w:r>
         <w:rPr>
           <w:rStyle w:val="DataTypeTok"/>
         </w:rPr>
@@ -2081,12 +1987,6 @@
       </w:r>
       <w:r>
         <w:rPr>
-          <w:rStyle w:val="NormalTok"/>
-        </w:rPr>
-        <w:t xml:space="preserve"> </w:t>
-      </w:r>
-      <w:r>
-        <w:rPr>
           <w:rStyle w:val="StringTok"/>
         </w:rPr>
         <w:t xml:space="preserve">"{{interval}}"</w:t>
@@ -2098,179 +1998,86 @@
         <w:t xml:space="preserve">,</w:t>
       </w:r>
       <w:r>
-        <w:br/>
-      </w:r>
-      <w:r>
-        <w:rPr>
-          <w:rStyle w:val="NormalTok"/>
-        </w:rPr>
-        <w:t xml:space="preserve">  </w:t>
-      </w:r>
-      <w:r>
         <w:rPr>
           <w:rStyle w:val="DataTypeTok"/>
         </w:rPr>
-        <w:t xml:space="preserve">"rsi"</w:t>
+        <w:t xml:space="preserve">"entry"</w:t>
       </w:r>
       <w:r>
         <w:rPr>
           <w:rStyle w:val="FunctionTok"/>
         </w:rPr>
-        <w:t xml:space="preserve">:</w:t>
-      </w:r>
-      <w:r>
-        <w:rPr>
-          <w:rStyle w:val="NormalTok"/>
-        </w:rPr>
-        <w:t xml:space="preserve"> </w:t>
+        <w:t xml:space="preserve">:{</w:t>
+      </w:r>
+      <w:r>
+        <w:rPr>
+          <w:rStyle w:val="ErrorTok"/>
+        </w:rPr>
+        <w:t xml:space="preserve">{close</w:t>
       </w:r>
       <w:r>
         <w:rPr>
           <w:rStyle w:val="FunctionTok"/>
         </w:rPr>
-        <w:t xml:space="preserve">{</w:t>
+        <w:t xml:space="preserve">}}</w:t>
       </w:r>
       <w:r>
         <w:rPr>
           <w:rStyle w:val="ErrorTok"/>
         </w:rPr>
-        <w:t xml:space="preserve">{plot(</w:t>
-      </w:r>
-      <w:r>
-        <w:rPr>
-          <w:rStyle w:val="DataTypeTok"/>
-        </w:rPr>
-        <w:t xml:space="preserve">"RSI"</w:t>
-      </w:r>
-      <w:r>
-        <w:rPr>
-          <w:rStyle w:val="ErrorTok"/>
-        </w:rPr>
+        <w:t xml:space="preserve">}</w:t>
+      </w:r>
+    </w:p>
+    <w:p>
+      <w:pPr>
+        <w:numPr>
+          <w:ilvl w:val="0"/>
+          <w:numId w:val="1000"/>
+        </w:numPr>
+      </w:pPr>
+      <w:r>
+        <w:t xml:space="preserve">(para o alerta de cruzamento</w:t>
+      </w:r>
+      <w:r>
+        <w:t xml:space="preserve"> </w:t>
+      </w:r>
+      <w:r>
+        <w:rPr>
+          <w:bCs/>
+          <w:b/>
+        </w:rPr>
+        <w:t xml:space="preserve">pra baixo</w:t>
+      </w:r>
+      <w:r>
+        <w:t xml:space="preserve">, troque</w:t>
+      </w:r>
+      <w:r>
+        <w:t xml:space="preserve"> </w:t>
+      </w:r>
+      <w:r>
+        <w:rPr>
+          <w:rStyle w:val="VerbatimChar"/>
+        </w:rPr>
+        <w:t xml:space="preserve">"buy"</w:t>
+      </w:r>
+      <w:r>
+        <w:t xml:space="preserve"> </w:t>
+      </w:r>
+      <w:r>
+        <w:t xml:space="preserve">por</w:t>
+      </w:r>
+      <w:r>
+        <w:t xml:space="preserve"> </w:t>
+      </w:r>
+      <w:r>
+        <w:rPr>
+          <w:rStyle w:val="VerbatimChar"/>
+        </w:rPr>
+        <w:t xml:space="preserve">"sell"</w:t>
+      </w:r>
+      <w:r>
         <w:t xml:space="preserve">)</w:t>
       </w:r>
-      <w:r>
-        <w:rPr>
-          <w:rStyle w:val="FunctionTok"/>
-        </w:rPr>
-        <w:t xml:space="preserve">}}</w:t>
-      </w:r>
-      <w:r>
-        <w:rPr>
-          <w:rStyle w:val="ErrorTok"/>
-        </w:rPr>
-        <w:t xml:space="preserve">,</w:t>
-      </w:r>
-      <w:r>
-        <w:br/>
-      </w:r>
-      <w:r>
-        <w:rPr>
-          <w:rStyle w:val="NormalTok"/>
-        </w:rPr>
-        <w:t xml:space="preserve">  </w:t>
-      </w:r>
-      <w:r>
-        <w:rPr>
-          <w:rStyle w:val="ErrorTok"/>
-        </w:rPr>
-        <w:t xml:space="preserve">"rsi_ma":</w:t>
-      </w:r>
-      <w:r>
-        <w:rPr>
-          <w:rStyle w:val="NormalTok"/>
-        </w:rPr>
-        <w:t xml:space="preserve"> </w:t>
-      </w:r>
-      <w:r>
-        <w:rPr>
-          <w:rStyle w:val="FunctionTok"/>
-        </w:rPr>
-        <w:t xml:space="preserve">{</w:t>
-      </w:r>
-      <w:r>
-        <w:rPr>
-          <w:rStyle w:val="ErrorTok"/>
-        </w:rPr>
-        <w:t xml:space="preserve">{plot(</w:t>
-      </w:r>
-      <w:r>
-        <w:rPr>
-          <w:rStyle w:val="DataTypeTok"/>
-        </w:rPr>
-        <w:t xml:space="preserve">"RSI_MA"</w:t>
-      </w:r>
-      <w:r>
-        <w:rPr>
-          <w:rStyle w:val="ErrorTok"/>
-        </w:rPr>
-        <w:t xml:space="preserve">)</w:t>
-      </w:r>
-      <w:r>
-        <w:rPr>
-          <w:rStyle w:val="FunctionTok"/>
-        </w:rPr>
-        <w:t xml:space="preserve">}</w:t>
-      </w:r>
-      <w:r>
-        <w:rPr>
-          <w:rStyle w:val="ErrorTok"/>
-        </w:rPr>
-        <w:t xml:space="preserve">},</w:t>
-      </w:r>
-      <w:r>
-        <w:br/>
-      </w:r>
-      <w:r>
-        <w:rPr>
-          <w:rStyle w:val="NormalTok"/>
-        </w:rPr>
-        <w:t xml:space="preserve">  </w:t>
-      </w:r>
-      <w:r>
-        <w:rPr>
-          <w:rStyle w:val="ErrorTok"/>
-        </w:rPr>
-        <w:t xml:space="preserve">"entry":</w:t>
-      </w:r>
-      <w:r>
-        <w:rPr>
-          <w:rStyle w:val="NormalTok"/>
-        </w:rPr>
-        <w:t xml:space="preserve"> </w:t>
-      </w:r>
-      <w:r>
-        <w:rPr>
-          <w:rStyle w:val="FunctionTok"/>
-        </w:rPr>
-        <w:t xml:space="preserve">{</w:t>
-      </w:r>
-      <w:r>
-        <w:rPr>
-          <w:rStyle w:val="ErrorTok"/>
-        </w:rPr>
-        <w:t xml:space="preserve">{close</w:t>
-      </w:r>
-      <w:r>
-        <w:rPr>
-          <w:rStyle w:val="FunctionTok"/>
-        </w:rPr>
-        <w:t xml:space="preserve">}</w:t>
-      </w:r>
-      <w:r>
-        <w:rPr>
-          <w:rStyle w:val="ErrorTok"/>
-        </w:rPr>
-        <w:t xml:space="preserve">}</w:t>
-      </w:r>
-      <w:r>
-        <w:br/>
-      </w:r>
-      <w:r>
-        <w:rPr>
-          <w:rStyle w:val="ErrorTok"/>
-        </w:rPr>
-        <w:t xml:space="preserve">}</w:t>
-      </w:r>
     </w:p>
     <w:p>
       <w:pPr>
@@ -2299,7 +2106,7 @@
         <w:rPr>
           <w:rStyle w:val="VerbatimChar"/>
         </w:rPr>
-        <w:t xml:space="preserve">[SNIPER] BTC 5m - TSTS</w:t>
+        <w:t xml:space="preserve">[SNIPER] BTC 5m - TSTS UP</w:t>
       </w:r>
     </w:p>
     <w:p>
@@ -2617,15 +2424,6 @@
         <w:t xml:space="preserve">{</w:t>
       </w:r>
       <w:r>
-        <w:br/>
-      </w:r>
-      <w:r>
-        <w:rPr>
-          <w:rStyle w:val="NormalTok"/>
-        </w:rPr>
-        <w:t xml:space="preserve">  </w:t>
-      </w:r>
-      <w:r>
         <w:rPr>
           <w:rStyle w:val="DataTypeTok"/>
         </w:rPr>
@@ -2639,12 +2437,6 @@
       </w:r>
       <w:r>
         <w:rPr>
-          <w:rStyle w:val="NormalTok"/>
-        </w:rPr>
-        <w:t xml:space="preserve"> </w:t>
-      </w:r>
-      <w:r>
-        <w:rPr>
           <w:rStyle w:val="StringTok"/>
         </w:rPr>
         <w:t xml:space="preserve">"up"</w:t>
@@ -2656,15 +2448,6 @@
         <w:t xml:space="preserve">,</w:t>
       </w:r>
       <w:r>
-        <w:br/>
-      </w:r>
-      <w:r>
-        <w:rPr>
-          <w:rStyle w:val="NormalTok"/>
-        </w:rPr>
-        <w:t xml:space="preserve">  </w:t>
-      </w:r>
-      <w:r>
         <w:rPr>
           <w:rStyle w:val="DataTypeTok"/>
         </w:rPr>
@@ -2678,12 +2461,6 @@
       </w:r>
       <w:r>
         <w:rPr>
-          <w:rStyle w:val="NormalTok"/>
-        </w:rPr>
-        <w:t xml:space="preserve"> </w:t>
-      </w:r>
-      <w:r>
-        <w:rPr>
           <w:rStyle w:val="StringTok"/>
         </w:rPr>
         <w:t xml:space="preserve">"{{interval}}"</w:t>
@@ -2691,135 +2468,6 @@
       <w:r>
         <w:rPr>
           <w:rStyle w:val="FunctionTok"/>
-        </w:rPr>
-        <w:t xml:space="preserve">,</w:t>
-      </w:r>
-      <w:r>
-        <w:br/>
-      </w:r>
-      <w:r>
-        <w:rPr>
-          <w:rStyle w:val="NormalTok"/>
-        </w:rPr>
-        <w:t xml:space="preserve">  </w:t>
-      </w:r>
-      <w:r>
-        <w:rPr>
-          <w:rStyle w:val="DataTypeTok"/>
-        </w:rPr>
-        <w:t xml:space="preserve">"rsi"</w:t>
-      </w:r>
-      <w:r>
-        <w:rPr>
-          <w:rStyle w:val="FunctionTok"/>
-        </w:rPr>
-        <w:t xml:space="preserve">:</w:t>
-      </w:r>
-      <w:r>
-        <w:rPr>
-          <w:rStyle w:val="NormalTok"/>
-        </w:rPr>
-        <w:t xml:space="preserve"> </w:t>
-      </w:r>
-      <w:r>
-        <w:rPr>
-          <w:rStyle w:val="FunctionTok"/>
-        </w:rPr>
-        <w:t xml:space="preserve">{</w:t>
-      </w:r>
-      <w:r>
-        <w:rPr>
-          <w:rStyle w:val="ErrorTok"/>
-        </w:rPr>
-        <w:t xml:space="preserve">{plot(</w:t>
-      </w:r>
-      <w:r>
-        <w:rPr>
-          <w:rStyle w:val="DataTypeTok"/>
-        </w:rPr>
-        <w:t xml:space="preserve">"RSI"</w:t>
-      </w:r>
-      <w:r>
-        <w:rPr>
-          <w:rStyle w:val="ErrorTok"/>
-        </w:rPr>
-        <w:t xml:space="preserve">)</w:t>
-      </w:r>
-      <w:r>
-        <w:rPr>
-          <w:rStyle w:val="FunctionTok"/>
-        </w:rPr>
-        <w:t xml:space="preserve">}}</w:t>
-      </w:r>
-      <w:r>
-        <w:rPr>
-          <w:rStyle w:val="ErrorTok"/>
-        </w:rPr>
-        <w:t xml:space="preserve">,</w:t>
-      </w:r>
-      <w:r>
-        <w:br/>
-      </w:r>
-      <w:r>
-        <w:rPr>
-          <w:rStyle w:val="NormalTok"/>
-        </w:rPr>
-        <w:t xml:space="preserve">  </w:t>
-      </w:r>
-      <w:r>
-        <w:rPr>
-          <w:rStyle w:val="ErrorTok"/>
-        </w:rPr>
-        <w:t xml:space="preserve">"rsi_ma":</w:t>
-      </w:r>
-      <w:r>
-        <w:rPr>
-          <w:rStyle w:val="NormalTok"/>
-        </w:rPr>
-        <w:t xml:space="preserve"> </w:t>
-      </w:r>
-      <w:r>
-        <w:rPr>
-          <w:rStyle w:val="FunctionTok"/>
-        </w:rPr>
-        <w:t xml:space="preserve">{</w:t>
-      </w:r>
-      <w:r>
-        <w:rPr>
-          <w:rStyle w:val="ErrorTok"/>
-        </w:rPr>
-        <w:t xml:space="preserve">{plot(</w:t>
-      </w:r>
-      <w:r>
-        <w:rPr>
-          <w:rStyle w:val="DataTypeTok"/>
-        </w:rPr>
-        <w:t xml:space="preserve">"RSI_MA"</w:t>
-      </w:r>
-      <w:r>
-        <w:rPr>
-          <w:rStyle w:val="ErrorTok"/>
-        </w:rPr>
-        <w:t xml:space="preserve">)</w:t>
-      </w:r>
-      <w:r>
-        <w:rPr>
-          <w:rStyle w:val="FunctionTok"/>
-        </w:rPr>
-        <w:t xml:space="preserve">}</w:t>
-      </w:r>
-      <w:r>
-        <w:rPr>
-          <w:rStyle w:val="ErrorTok"/>
-        </w:rPr>
-        <w:t xml:space="preserve">}</w:t>
-      </w:r>
-      <w:r>
-        <w:br/>
-      </w:r>
-      <w:r>
-        <w:rPr>
-          <w:rStyle w:val="ErrorTok"/>
         </w:rPr>
         <w:t xml:space="preserve">}</w:t>
       </w:r>
@@ -3127,15 +2775,6 @@
         <w:t xml:space="preserve">{</w:t>
       </w:r>
       <w:r>
-        <w:br/>
-      </w:r>
-      <w:r>
-        <w:rPr>
-          <w:rStyle w:val="NormalTok"/>
-        </w:rPr>
-        <w:t xml:space="preserve">  </w:t>
-      </w:r>
-      <w:r>
         <w:rPr>
           <w:rStyle w:val="DataTypeTok"/>
         </w:rPr>
@@ -3149,12 +2788,6 @@
       </w:r>
       <w:r>
         <w:rPr>
-          <w:rStyle w:val="NormalTok"/>
-        </w:rPr>
-        <w:t xml:space="preserve"> </w:t>
-      </w:r>
-      <w:r>
-        <w:rPr>
           <w:rStyle w:val="StringTok"/>
         </w:rPr>
         <w:t xml:space="preserve">"down"</w:t>
@@ -3166,15 +2799,6 @@
         <w:t xml:space="preserve">,</w:t>
       </w:r>
       <w:r>
-        <w:br/>
-      </w:r>
-      <w:r>
-        <w:rPr>
-          <w:rStyle w:val="NormalTok"/>
-        </w:rPr>
-        <w:t xml:space="preserve">  </w:t>
-      </w:r>
-      <w:r>
         <w:rPr>
           <w:rStyle w:val="DataTypeTok"/>
         </w:rPr>
@@ -3188,12 +2812,6 @@
       </w:r>
       <w:r>
         <w:rPr>
-          <w:rStyle w:val="NormalTok"/>
-        </w:rPr>
-        <w:t xml:space="preserve"> </w:t>
-      </w:r>
-      <w:r>
-        <w:rPr>
           <w:rStyle w:val="StringTok"/>
         </w:rPr>
         <w:t xml:space="preserve">"{{interval}}"</w:t>
@@ -3201,135 +2819,6 @@
       <w:r>
         <w:rPr>
           <w:rStyle w:val="FunctionTok"/>
-        </w:rPr>
-        <w:t xml:space="preserve">,</w:t>
-      </w:r>
-      <w:r>
-        <w:br/>
-      </w:r>
-      <w:r>
-        <w:rPr>
-          <w:rStyle w:val="NormalTok"/>
-        </w:rPr>
-        <w:t xml:space="preserve">  </w:t>
-      </w:r>
-      <w:r>
-        <w:rPr>
-          <w:rStyle w:val="DataTypeTok"/>
-        </w:rPr>
-        <w:t xml:space="preserve">"rsi"</w:t>
-      </w:r>
-      <w:r>
-        <w:rPr>
-          <w:rStyle w:val="FunctionTok"/>
-        </w:rPr>
-        <w:t xml:space="preserve">:</w:t>
-      </w:r>
-      <w:r>
-        <w:rPr>
-          <w:rStyle w:val="NormalTok"/>
-        </w:rPr>
-        <w:t xml:space="preserve"> </w:t>
-      </w:r>
-      <w:r>
-        <w:rPr>
-          <w:rStyle w:val="FunctionTok"/>
-        </w:rPr>
-        <w:t xml:space="preserve">{</w:t>
-      </w:r>
-      <w:r>
-        <w:rPr>
-          <w:rStyle w:val="ErrorTok"/>
-        </w:rPr>
-        <w:t xml:space="preserve">{plot(</w:t>
-      </w:r>
-      <w:r>
-        <w:rPr>
-          <w:rStyle w:val="DataTypeTok"/>
-        </w:rPr>
-        <w:t xml:space="preserve">"RSI"</w:t>
-      </w:r>
-      <w:r>
-        <w:rPr>
-          <w:rStyle w:val="ErrorTok"/>
-        </w:rPr>
-        <w:t xml:space="preserve">)</w:t>
-      </w:r>
-      <w:r>
-        <w:rPr>
-          <w:rStyle w:val="FunctionTok"/>
-        </w:rPr>
-        <w:t xml:space="preserve">}}</w:t>
-      </w:r>
-      <w:r>
-        <w:rPr>
-          <w:rStyle w:val="ErrorTok"/>
-        </w:rPr>
-        <w:t xml:space="preserve">,</w:t>
-      </w:r>
-      <w:r>
-        <w:br/>
-      </w:r>
-      <w:r>
-        <w:rPr>
-          <w:rStyle w:val="NormalTok"/>
-        </w:rPr>
-        <w:t xml:space="preserve">  </w:t>
-      </w:r>
-      <w:r>
-        <w:rPr>
-          <w:rStyle w:val="ErrorTok"/>
-        </w:rPr>
-        <w:t xml:space="preserve">"rsi_ma":</w:t>
-      </w:r>
-      <w:r>
-        <w:rPr>
-          <w:rStyle w:val="NormalTok"/>
-        </w:rPr>
-        <w:t xml:space="preserve"> </w:t>
-      </w:r>
-      <w:r>
-        <w:rPr>
-          <w:rStyle w:val="FunctionTok"/>
-        </w:rPr>
-        <w:t xml:space="preserve">{</w:t>
-      </w:r>
-      <w:r>
-        <w:rPr>
-          <w:rStyle w:val="ErrorTok"/>
-        </w:rPr>
-        <w:t xml:space="preserve">{plot(</w:t>
-      </w:r>
-      <w:r>
-        <w:rPr>
-          <w:rStyle w:val="DataTypeTok"/>
-        </w:rPr>
-        <w:t xml:space="preserve">"RSI_MA"</w:t>
-      </w:r>
-      <w:r>
-        <w:rPr>
-          <w:rStyle w:val="ErrorTok"/>
-        </w:rPr>
-        <w:t xml:space="preserve">)</w:t>
-      </w:r>
-      <w:r>
-        <w:rPr>
-          <w:rStyle w:val="FunctionTok"/>
-        </w:rPr>
-        <w:t xml:space="preserve">}</w:t>
-      </w:r>
-      <w:r>
-        <w:rPr>
-          <w:rStyle w:val="ErrorTok"/>
-        </w:rPr>
-        <w:t xml:space="preserve">}</w:t>
-      </w:r>
-      <w:r>
-        <w:br/>
-      </w:r>
-      <w:r>
-        <w:rPr>
-          <w:rStyle w:val="ErrorTok"/>
         </w:rPr>
         <w:t xml:space="preserve">}</w:t>
       </w:r>

</xml_diff>